<commit_message>
update exampledb.sh addthe password plain and add create the main ou and remove it from creat_top_ous.sh
</commit_message>
<xml_diff>
--- a/Symas OpenLDAP 2.docx
+++ b/Symas OpenLDAP 2.docx
@@ -683,7 +683,11 @@
       </w:r>
       <w:proofErr w:type="spellEnd"/>
       <w:r>
-        <w:t>/bin:/opt/</w:t>
+        <w:t>/</w:t>
+      </w:r>
+      <w:proofErr w:type="gramStart"/>
+      <w:r>
+        <w:t>bin:/opt/</w:t>
       </w:r>
       <w:proofErr w:type="spellStart"/>
       <w:r>
@@ -699,7 +703,11 @@
       </w:r>
       <w:proofErr w:type="spellEnd"/>
       <w:r>
-        <w:t>:$PATH</w:t>
+        <w:t>:$</w:t>
+      </w:r>
+      <w:proofErr w:type="gramEnd"/>
+      <w:r>
+        <w:t>PATH</w:t>
       </w:r>
     </w:p>
     <w:p>
@@ -800,8 +808,13 @@
         <w:t>symas</w:t>
       </w:r>
       <w:proofErr w:type="spellEnd"/>
-      <w:r>
-        <w:t>" ]; then</w:t>
+      <w:proofErr w:type="gramStart"/>
+      <w:r>
+        <w:t>" ]</w:t>
+      </w:r>
+      <w:proofErr w:type="gramEnd"/>
+      <w:r>
+        <w:t>; then</w:t>
       </w:r>
     </w:p>
     <w:p>
@@ -840,7 +853,11 @@
       </w:r>
       <w:proofErr w:type="spellEnd"/>
       <w:r>
-        <w:t>/bin:/opt/</w:t>
+        <w:t>/</w:t>
+      </w:r>
+      <w:proofErr w:type="gramStart"/>
+      <w:r>
+        <w:t>bin:/opt/</w:t>
       </w:r>
       <w:proofErr w:type="spellStart"/>
       <w:r>
@@ -856,7 +873,11 @@
       </w:r>
       <w:proofErr w:type="spellEnd"/>
       <w:r>
-        <w:t>:$PATH</w:t>
+        <w:t>:$</w:t>
+      </w:r>
+      <w:proofErr w:type="gramEnd"/>
+      <w:r>
+        <w:t>PATH</w:t>
       </w:r>
     </w:p>
     <w:p>
@@ -1054,7 +1075,21 @@
             <w:color w:val="1155CC"/>
             <w:u w:val="single"/>
           </w:rPr>
-          <w:t>kb.symas.com</w:t>
+          <w:t>kb.s</w:t>
+        </w:r>
+        <w:r>
+          <w:rPr>
+            <w:color w:val="1155CC"/>
+            <w:u w:val="single"/>
+          </w:rPr>
+          <w:t>y</w:t>
+        </w:r>
+        <w:r>
+          <w:rPr>
+            <w:color w:val="1155CC"/>
+            <w:u w:val="single"/>
+          </w:rPr>
+          <w:t>mas.com</w:t>
         </w:r>
       </w:hyperlink>
       <w:r>
@@ -1358,6 +1393,7 @@
         <w:t xml:space="preserve">you must create the </w:t>
       </w:r>
       <w:proofErr w:type="spellStart"/>
+      <w:proofErr w:type="gramStart"/>
       <w:r>
         <w:rPr>
           <w:rFonts w:ascii="Roboto Mono" w:eastAsia="Roboto Mono" w:hAnsi="Roboto Mono" w:cs="Roboto Mono"/>
@@ -1368,6 +1404,7 @@
         <w:t>slapd.d</w:t>
       </w:r>
       <w:proofErr w:type="spellEnd"/>
+      <w:proofErr w:type="gramEnd"/>
       <w:r>
         <w:rPr>
           <w:b/>
@@ -1415,7 +1452,15 @@
         <w:spacing w:before="240" w:after="240"/>
       </w:pPr>
       <w:r>
-        <w:t>CHECK FIRST THE BELOW FOLER IF NOT CREATED ,CREATE IT USING THE FOLLOWING COMMAND</w:t>
+        <w:t xml:space="preserve">CHECK FIRST THE BELOW FOLER IF NOT </w:t>
+      </w:r>
+      <w:proofErr w:type="gramStart"/>
+      <w:r>
+        <w:t>CREATED ,CREATE</w:t>
+      </w:r>
+      <w:proofErr w:type="gramEnd"/>
+      <w:r>
+        <w:t xml:space="preserve"> IT USING THE FOLLOWING COMMAND</w:t>
       </w:r>
     </w:p>
     <w:p>
@@ -1446,10 +1491,12 @@
         <w:t xml:space="preserve"> -p </w:t>
       </w:r>
       <w:proofErr w:type="spellStart"/>
+      <w:proofErr w:type="gramStart"/>
       <w:r>
         <w:t>slapd.d</w:t>
       </w:r>
       <w:proofErr w:type="spellEnd"/>
+      <w:proofErr w:type="gramEnd"/>
     </w:p>
     <w:p>
       <w:proofErr w:type="spellStart"/>
@@ -1485,10 +1532,12 @@
         <w:t>/</w:t>
       </w:r>
       <w:proofErr w:type="spellStart"/>
+      <w:proofErr w:type="gramStart"/>
       <w:r>
         <w:t>slapd.d</w:t>
       </w:r>
       <w:proofErr w:type="spellEnd"/>
+      <w:proofErr w:type="gramEnd"/>
     </w:p>
     <w:p/>
     <w:p>
@@ -1632,9 +1681,20 @@
           <w:bCs/>
           <w:color w:val="188038"/>
         </w:rPr>
-        <w:t>symas-openldap-servers.service</w:t>
-      </w:r>
-      <w:proofErr w:type="spellEnd"/>
+        <w:t>symas-openldap-</w:t>
+      </w:r>
+      <w:proofErr w:type="gramStart"/>
+      <w:r>
+        <w:rPr>
+          <w:rFonts w:ascii="Roboto Mono" w:eastAsia="Roboto Mono" w:hAnsi="Roboto Mono" w:cs="Roboto Mono"/>
+          <w:b/>
+          <w:bCs/>
+          <w:color w:val="188038"/>
+        </w:rPr>
+        <w:t>servers.service</w:t>
+      </w:r>
+      <w:proofErr w:type="spellEnd"/>
+      <w:proofErr w:type="gramEnd"/>
       <w:r>
         <w:t xml:space="preserve"> with an alias/target often referenced as </w:t>
       </w:r>
@@ -1656,9 +1716,18 @@
           <w:rFonts w:ascii="Roboto Mono" w:eastAsia="Roboto Mono" w:hAnsi="Roboto Mono" w:cs="Roboto Mono"/>
           <w:color w:val="188038"/>
         </w:rPr>
-        <w:t>symas-openldap-servers.service</w:t>
-      </w:r>
-      <w:proofErr w:type="spellEnd"/>
+        <w:t>symas-openldap-</w:t>
+      </w:r>
+      <w:proofErr w:type="gramStart"/>
+      <w:r>
+        <w:rPr>
+          <w:rFonts w:ascii="Roboto Mono" w:eastAsia="Roboto Mono" w:hAnsi="Roboto Mono" w:cs="Roboto Mono"/>
+          <w:color w:val="188038"/>
+        </w:rPr>
+        <w:t>servers.service</w:t>
+      </w:r>
+      <w:proofErr w:type="spellEnd"/>
+      <w:proofErr w:type="gramEnd"/>
       <w:r>
         <w:t xml:space="preserve"> failing until config existed.)</w:t>
       </w:r>
@@ -1819,7 +1888,15 @@
         <w:spacing w:before="240" w:after="240"/>
       </w:pPr>
       <w:r>
-        <w:t>In environments where the concrete unit name is required, use:</w:t>
+        <w:t xml:space="preserve">In environments where the concrete </w:t>
+      </w:r>
+      <w:proofErr w:type="gramStart"/>
+      <w:r>
+        <w:t>unit</w:t>
+      </w:r>
+      <w:proofErr w:type="gramEnd"/>
+      <w:r>
+        <w:t xml:space="preserve"> name is required, use:</w:t>
       </w:r>
     </w:p>
     <w:p>
@@ -1946,7 +2023,11 @@
       </w:r>
       <w:proofErr w:type="spellEnd"/>
       <w:r>
-        <w:t xml:space="preserve"> -p /etc/</w:t>
+        <w:t xml:space="preserve"> -p </w:t>
+      </w:r>
+      <w:proofErr w:type="gramStart"/>
+      <w:r>
+        <w:t>/etc/</w:t>
       </w:r>
       <w:proofErr w:type="spellStart"/>
       <w:r>
@@ -1961,6 +2042,7 @@
         <w:t>symas-openldap-servers.service.d</w:t>
       </w:r>
       <w:proofErr w:type="spellEnd"/>
+      <w:proofErr w:type="gramEnd"/>
     </w:p>
     <w:p>
       <w:r>
@@ -2221,7 +2303,15 @@
       </w:r>
       <w:proofErr w:type="spellEnd"/>
       <w:r>
-        <w:t xml:space="preserve"> 's|^SLAPD_URLS=.*|SLAPD_URLS="</w:t>
+        <w:t xml:space="preserve"> 's|^SLAPD_URLS</w:t>
+      </w:r>
+      <w:proofErr w:type="gramStart"/>
+      <w:r>
+        <w:t>=.*</w:t>
+      </w:r>
+      <w:proofErr w:type="gramEnd"/>
+      <w:r>
+        <w:t>|SLAPD_URLS="</w:t>
       </w:r>
       <w:proofErr w:type="spellStart"/>
       <w:r>
@@ -2255,7 +2345,15 @@
       </w:r>
       <w:proofErr w:type="spellEnd"/>
       <w:r>
-        <w:t xml:space="preserve"> 's|^SLAPD_OPTIONS=.*|SLAPD_OPTIONS="-u </w:t>
+        <w:t xml:space="preserve"> 's|^SLAPD_OPTIONS</w:t>
+      </w:r>
+      <w:proofErr w:type="gramStart"/>
+      <w:r>
+        <w:t>=.*</w:t>
+      </w:r>
+      <w:proofErr w:type="gramEnd"/>
+      <w:r>
+        <w:t xml:space="preserve">|SLAPD_OPTIONS="-u </w:t>
       </w:r>
       <w:proofErr w:type="spellStart"/>
       <w:r>
@@ -2656,6 +2754,33 @@
       </w:r>
     </w:p>
     <w:p>
+      <w:pPr>
+        <w:spacing w:before="240" w:after="240"/>
+        <w:rPr>
+          <w:b/>
+          <w:bCs/>
+        </w:rPr>
+      </w:pPr>
+      <w:proofErr w:type="spellStart"/>
+      <w:proofErr w:type="gramStart"/>
+      <w:r>
+        <w:rPr>
+          <w:b/>
+          <w:bCs/>
+        </w:rPr>
+        <w:t>NOTE:install</w:t>
+      </w:r>
+      <w:proofErr w:type="spellEnd"/>
+      <w:proofErr w:type="gramEnd"/>
+      <w:r>
+        <w:rPr>
+          <w:b/>
+          <w:bCs/>
+        </w:rPr>
+        <w:t xml:space="preserve"> 8.A otherwise search will not work</w:t>
+      </w:r>
+    </w:p>
+    <w:p>
       <w:r>
         <w:pict w14:anchorId="06C1F1EC">
           <v:rect id="_x0000_i1033" style="width:0;height:1.5pt" o:hralign="center" o:hrstd="t" o:hr="t" fillcolor="#a0a0a0" stroked="f"/>
@@ -2739,13 +2864,23 @@
     <w:p>
       <w:pPr>
         <w:spacing w:before="240" w:after="240"/>
-      </w:pPr>
-      <w:r>
+        <w:rPr>
+          <w:b/>
+          <w:bCs/>
+        </w:rPr>
+      </w:pPr>
+      <w:r>
+        <w:rPr>
+          <w:b/>
+          <w:bCs/>
+        </w:rPr>
         <w:t xml:space="preserve">Install clients + ensure </w:t>
       </w:r>
       <w:r>
         <w:rPr>
           <w:rFonts w:ascii="Roboto Mono" w:eastAsia="Roboto Mono" w:hAnsi="Roboto Mono" w:cs="Roboto Mono"/>
+          <w:b/>
+          <w:bCs/>
           <w:color w:val="188038"/>
         </w:rPr>
         <w:t>/opt/</w:t>
@@ -2754,6 +2889,8 @@
       <w:r>
         <w:rPr>
           <w:rFonts w:ascii="Roboto Mono" w:eastAsia="Roboto Mono" w:hAnsi="Roboto Mono" w:cs="Roboto Mono"/>
+          <w:b/>
+          <w:bCs/>
           <w:color w:val="188038"/>
         </w:rPr>
         <w:t>symas</w:t>
@@ -2762,16 +2899,24 @@
       <w:r>
         <w:rPr>
           <w:rFonts w:ascii="Roboto Mono" w:eastAsia="Roboto Mono" w:hAnsi="Roboto Mono" w:cs="Roboto Mono"/>
+          <w:b/>
+          <w:bCs/>
           <w:color w:val="188038"/>
         </w:rPr>
         <w:t>/bin</w:t>
       </w:r>
       <w:r>
+        <w:rPr>
+          <w:b/>
+          <w:bCs/>
+        </w:rPr>
         <w:t xml:space="preserve"> is in PATH. (</w:t>
       </w:r>
       <w:hyperlink r:id="rId19">
         <w:r>
           <w:rPr>
+            <w:b/>
+            <w:bCs/>
             <w:color w:val="1155CC"/>
             <w:u w:val="single"/>
           </w:rPr>
@@ -2779,62 +2924,146 @@
         </w:r>
       </w:hyperlink>
       <w:r>
+        <w:rPr>
+          <w:b/>
+          <w:bCs/>
+        </w:rPr>
         <w:t>)</w:t>
       </w:r>
     </w:p>
     <w:p>
-      <w:proofErr w:type="spellStart"/>
-      <w:r>
+      <w:pPr>
+        <w:rPr>
+          <w:b/>
+          <w:bCs/>
+        </w:rPr>
+      </w:pPr>
+      <w:proofErr w:type="spellStart"/>
+      <w:r>
+        <w:rPr>
+          <w:b/>
+          <w:bCs/>
+        </w:rPr>
         <w:t>dnf</w:t>
       </w:r>
       <w:proofErr w:type="spellEnd"/>
       <w:r>
+        <w:rPr>
+          <w:b/>
+          <w:bCs/>
+        </w:rPr>
         <w:t xml:space="preserve"> install -y </w:t>
       </w:r>
       <w:proofErr w:type="spellStart"/>
       <w:r>
+        <w:rPr>
+          <w:b/>
+          <w:bCs/>
+        </w:rPr>
         <w:t>symas</w:t>
       </w:r>
       <w:proofErr w:type="spellEnd"/>
       <w:r>
+        <w:rPr>
+          <w:b/>
+          <w:bCs/>
+        </w:rPr>
         <w:t>-</w:t>
       </w:r>
       <w:proofErr w:type="spellStart"/>
       <w:r>
+        <w:rPr>
+          <w:b/>
+          <w:bCs/>
+        </w:rPr>
         <w:t>openldap</w:t>
       </w:r>
       <w:proofErr w:type="spellEnd"/>
       <w:r>
+        <w:rPr>
+          <w:b/>
+          <w:bCs/>
+        </w:rPr>
         <w:t>-clients</w:t>
       </w:r>
     </w:p>
     <w:p>
-      <w:r>
+      <w:pPr>
+        <w:rPr>
+          <w:b/>
+          <w:bCs/>
+        </w:rPr>
+      </w:pPr>
+      <w:r>
+        <w:rPr>
+          <w:b/>
+          <w:bCs/>
+        </w:rPr>
         <w:t>export PATH=/opt/</w:t>
       </w:r>
       <w:proofErr w:type="spellStart"/>
       <w:r>
+        <w:rPr>
+          <w:b/>
+          <w:bCs/>
+        </w:rPr>
         <w:t>symas</w:t>
       </w:r>
       <w:proofErr w:type="spellEnd"/>
       <w:r>
-        <w:t>/bin:/opt/</w:t>
-      </w:r>
-      <w:proofErr w:type="spellStart"/>
-      <w:r>
+        <w:rPr>
+          <w:b/>
+          <w:bCs/>
+        </w:rPr>
+        <w:t>/</w:t>
+      </w:r>
+      <w:proofErr w:type="gramStart"/>
+      <w:r>
+        <w:rPr>
+          <w:b/>
+          <w:bCs/>
+        </w:rPr>
+        <w:t>bin:/opt/</w:t>
+      </w:r>
+      <w:proofErr w:type="spellStart"/>
+      <w:r>
+        <w:rPr>
+          <w:b/>
+          <w:bCs/>
+        </w:rPr>
         <w:t>symas</w:t>
       </w:r>
       <w:proofErr w:type="spellEnd"/>
       <w:r>
+        <w:rPr>
+          <w:b/>
+          <w:bCs/>
+        </w:rPr>
         <w:t>/</w:t>
       </w:r>
       <w:proofErr w:type="spellStart"/>
       <w:r>
+        <w:rPr>
+          <w:b/>
+          <w:bCs/>
+        </w:rPr>
         <w:t>sbin</w:t>
       </w:r>
       <w:proofErr w:type="spellEnd"/>
       <w:r>
-        <w:t>:$PATH</w:t>
+        <w:rPr>
+          <w:b/>
+          <w:bCs/>
+        </w:rPr>
+        <w:t>:$</w:t>
+      </w:r>
+      <w:proofErr w:type="gramEnd"/>
+      <w:r>
+        <w:rPr>
+          <w:b/>
+          <w:bCs/>
+        </w:rPr>
+        <w:t>PATH</w:t>
       </w:r>
     </w:p>
     <w:p/>
@@ -2870,6 +3099,7 @@
         <w:spacing w:before="240" w:after="240"/>
       </w:pPr>
       <w:r>
+        <w:lastRenderedPageBreak/>
         <w:t>Symas notes the module path must be:</w:t>
       </w:r>
       <w:r>
@@ -2947,7 +3177,6 @@
           <w:sz w:val="26"/>
           <w:szCs w:val="26"/>
         </w:rPr>
-        <w:lastRenderedPageBreak/>
         <w:t xml:space="preserve">C) </w:t>
       </w:r>
       <w:proofErr w:type="spellStart"/>
@@ -3003,6 +3232,7 @@
         <w:t xml:space="preserve">Create </w:t>
       </w:r>
       <w:proofErr w:type="spellStart"/>
+      <w:proofErr w:type="gramStart"/>
       <w:r>
         <w:rPr>
           <w:rFonts w:ascii="Roboto Mono" w:eastAsia="Roboto Mono" w:hAnsi="Roboto Mono" w:cs="Roboto Mono"/>
@@ -3011,6 +3241,7 @@
         <w:t>slapd.d</w:t>
       </w:r>
       <w:proofErr w:type="spellEnd"/>
+      <w:proofErr w:type="gramEnd"/>
       <w:r>
         <w:t xml:space="preserve"> and relabel it exactly as Symas documents. (</w:t>
       </w:r>
@@ -3020,7 +3251,35 @@
             <w:color w:val="1155CC"/>
             <w:u w:val="single"/>
           </w:rPr>
-          <w:t>repo.symas.com</w:t>
+          <w:t>rep</w:t>
+        </w:r>
+        <w:r>
+          <w:rPr>
+            <w:color w:val="1155CC"/>
+            <w:u w:val="single"/>
+          </w:rPr>
+          <w:t>o</w:t>
+        </w:r>
+        <w:r>
+          <w:rPr>
+            <w:color w:val="1155CC"/>
+            <w:u w:val="single"/>
+          </w:rPr>
+          <w:t>.symas.</w:t>
+        </w:r>
+        <w:r>
+          <w:rPr>
+            <w:color w:val="1155CC"/>
+            <w:u w:val="single"/>
+          </w:rPr>
+          <w:t>c</w:t>
+        </w:r>
+        <w:r>
+          <w:rPr>
+            <w:color w:val="1155CC"/>
+            <w:u w:val="single"/>
+          </w:rPr>
+          <w:t>om</w:t>
         </w:r>
       </w:hyperlink>
       <w:r>
@@ -3647,26 +3906,32 @@
         <w:t>=</w:t>
       </w:r>
       <w:proofErr w:type="spellStart"/>
+      <w:proofErr w:type="gramStart"/>
       <w:r>
         <w:t>admin,dc</w:t>
       </w:r>
       <w:proofErr w:type="spellEnd"/>
+      <w:proofErr w:type="gramEnd"/>
       <w:r>
         <w:t>=</w:t>
       </w:r>
       <w:proofErr w:type="spellStart"/>
+      <w:proofErr w:type="gramStart"/>
       <w:r>
         <w:t>eab,dc</w:t>
       </w:r>
       <w:proofErr w:type="spellEnd"/>
+      <w:proofErr w:type="gramEnd"/>
       <w:r>
         <w:t>=</w:t>
       </w:r>
       <w:proofErr w:type="spellStart"/>
+      <w:proofErr w:type="gramStart"/>
       <w:r>
         <w:t>bank,dc</w:t>
       </w:r>
       <w:proofErr w:type="spellEnd"/>
+      <w:proofErr w:type="gramEnd"/>
       <w:r>
         <w:t>=local" \</w:t>
       </w:r>
@@ -3684,6 +3949,7 @@
         <w:pStyle w:val="ListParagraph"/>
       </w:pPr>
       <w:r>
+        <w:lastRenderedPageBreak/>
         <w:t xml:space="preserve">  -H ldap://localhost \</w:t>
       </w:r>
     </w:p>
@@ -3695,18 +3961,22 @@
         <w:t xml:space="preserve">  -b "dc=</w:t>
       </w:r>
       <w:proofErr w:type="spellStart"/>
+      <w:proofErr w:type="gramStart"/>
       <w:r>
         <w:t>eab,dc</w:t>
       </w:r>
       <w:proofErr w:type="spellEnd"/>
+      <w:proofErr w:type="gramEnd"/>
       <w:r>
         <w:t>=</w:t>
       </w:r>
       <w:proofErr w:type="spellStart"/>
+      <w:proofErr w:type="gramStart"/>
       <w:r>
         <w:t>bank,dc</w:t>
       </w:r>
       <w:proofErr w:type="spellEnd"/>
+      <w:proofErr w:type="gramEnd"/>
       <w:r>
         <w:t>=local"</w:t>
       </w:r>
@@ -3716,7 +3986,213 @@
         <w:pStyle w:val="ListParagraph"/>
       </w:pPr>
     </w:p>
+    <w:p>
+      <w:pPr>
+        <w:pStyle w:val="Heading2"/>
+        <w:keepNext w:val="0"/>
+        <w:keepLines w:val="0"/>
+        <w:spacing w:after="80"/>
+        <w:rPr>
+          <w:b/>
+          <w:bCs/>
+          <w:sz w:val="34"/>
+          <w:szCs w:val="34"/>
+        </w:rPr>
+      </w:pPr>
+      <w:r>
+        <w:rPr>
+          <w:b/>
+          <w:bCs/>
+          <w:sz w:val="34"/>
+          <w:szCs w:val="34"/>
+        </w:rPr>
+        <w:t xml:space="preserve">Route the LDAP to </w:t>
+      </w:r>
+      <w:proofErr w:type="spellStart"/>
+      <w:r>
+        <w:rPr>
+          <w:b/>
+          <w:bCs/>
+          <w:sz w:val="34"/>
+          <w:szCs w:val="34"/>
+        </w:rPr>
+        <w:t>cn</w:t>
+      </w:r>
+      <w:proofErr w:type="spellEnd"/>
+      <w:r>
+        <w:rPr>
+          <w:b/>
+          <w:bCs/>
+          <w:sz w:val="34"/>
+          <w:szCs w:val="34"/>
+        </w:rPr>
+        <w:t>=config</w:t>
+      </w:r>
+      <w:r>
+        <w:rPr>
+          <w:b/>
+          <w:bCs/>
+          <w:sz w:val="34"/>
+          <w:szCs w:val="34"/>
+        </w:rPr>
+        <w:t xml:space="preserve"> mode</w:t>
+      </w:r>
+    </w:p>
+    <w:p>
+      <w:r>
+        <w:t>vi /etc/systemd/system/symas-openldap-servers.service.d/override.conf</w:t>
+      </w:r>
+    </w:p>
+    <w:p>
+      <w:r>
+        <w:t xml:space="preserve">append the following </w:t>
+      </w:r>
+    </w:p>
+    <w:p>
+      <w:proofErr w:type="spellStart"/>
+      <w:r>
+        <w:t>ExecStart</w:t>
+      </w:r>
+      <w:proofErr w:type="spellEnd"/>
+      <w:r>
+        <w:t>=</w:t>
+      </w:r>
+    </w:p>
+    <w:p>
+      <w:proofErr w:type="spellStart"/>
+      <w:r>
+        <w:t>ExecStart</w:t>
+      </w:r>
+      <w:proofErr w:type="spellEnd"/>
+      <w:r>
+        <w:t>=/opt/</w:t>
+      </w:r>
+      <w:proofErr w:type="spellStart"/>
+      <w:r>
+        <w:t>symas</w:t>
+      </w:r>
+      <w:proofErr w:type="spellEnd"/>
+      <w:r>
+        <w:t>/lib/</w:t>
+      </w:r>
+      <w:proofErr w:type="spellStart"/>
+      <w:r>
+        <w:t>slapd</w:t>
+      </w:r>
+      <w:proofErr w:type="spellEnd"/>
+      <w:r>
+        <w:t xml:space="preserve"> -d 0 \</w:t>
+      </w:r>
+    </w:p>
+    <w:p>
+      <w:r>
+        <w:t xml:space="preserve">  -F /opt/</w:t>
+      </w:r>
+      <w:proofErr w:type="spellStart"/>
+      <w:r>
+        <w:t>symas</w:t>
+      </w:r>
+      <w:proofErr w:type="spellEnd"/>
+      <w:r>
+        <w:t>/etc/</w:t>
+      </w:r>
+      <w:proofErr w:type="spellStart"/>
+      <w:r>
+        <w:t>openldap</w:t>
+      </w:r>
+      <w:proofErr w:type="spellEnd"/>
+      <w:r>
+        <w:t>/</w:t>
+      </w:r>
+      <w:proofErr w:type="spellStart"/>
+      <w:proofErr w:type="gramStart"/>
+      <w:r>
+        <w:t>slapd.d</w:t>
+      </w:r>
+      <w:proofErr w:type="spellEnd"/>
+      <w:proofErr w:type="gramEnd"/>
+      <w:r>
+        <w:t xml:space="preserve"> \</w:t>
+      </w:r>
+    </w:p>
+    <w:p>
+      <w:r>
+        <w:t xml:space="preserve">  -h "</w:t>
+      </w:r>
+      <w:proofErr w:type="spellStart"/>
+      <w:r>
+        <w:t>ldap</w:t>
+      </w:r>
+      <w:proofErr w:type="spellEnd"/>
+      <w:r>
+        <w:t>:/// ldaps:/// ldapi:///"</w:t>
+      </w:r>
+    </w:p>
     <w:p/>
+    <w:p/>
+    <w:p>
+      <w:proofErr w:type="spellStart"/>
+      <w:r>
+        <w:t>systemctl</w:t>
+      </w:r>
+      <w:proofErr w:type="spellEnd"/>
+      <w:r>
+        <w:t xml:space="preserve"> daemon-reload</w:t>
+      </w:r>
+    </w:p>
+    <w:p>
+      <w:proofErr w:type="spellStart"/>
+      <w:r>
+        <w:t>systemctl</w:t>
+      </w:r>
+      <w:proofErr w:type="spellEnd"/>
+      <w:r>
+        <w:t xml:space="preserve"> start </w:t>
+      </w:r>
+      <w:proofErr w:type="spellStart"/>
+      <w:r>
+        <w:t>symas</w:t>
+      </w:r>
+      <w:proofErr w:type="spellEnd"/>
+      <w:r>
+        <w:t>-</w:t>
+      </w:r>
+      <w:proofErr w:type="spellStart"/>
+      <w:r>
+        <w:t>openldap</w:t>
+      </w:r>
+      <w:proofErr w:type="spellEnd"/>
+      <w:r>
+        <w:t>-servers</w:t>
+      </w:r>
+    </w:p>
+    <w:p/>
+    <w:p>
+      <w:proofErr w:type="spellStart"/>
+      <w:r>
+        <w:t>systemctl</w:t>
+      </w:r>
+      <w:proofErr w:type="spellEnd"/>
+      <w:r>
+        <w:t xml:space="preserve"> status </w:t>
+      </w:r>
+      <w:proofErr w:type="spellStart"/>
+      <w:r>
+        <w:t>symas</w:t>
+      </w:r>
+      <w:proofErr w:type="spellEnd"/>
+      <w:r>
+        <w:t>-</w:t>
+      </w:r>
+      <w:proofErr w:type="spellStart"/>
+      <w:r>
+        <w:t>openldap</w:t>
+      </w:r>
+      <w:proofErr w:type="spellEnd"/>
+      <w:r>
+        <w:t>-servers</w:t>
+      </w:r>
+    </w:p>
     <w:sectPr>
       <w:pgSz w:w="11909" w:h="16834"/>
       <w:pgMar w:top="1440" w:right="1440" w:bottom="1440" w:left="1440" w:header="720" w:footer="720" w:gutter="0"/>

</xml_diff>